<commit_message>
Fase 2 sincronizada: EP-21 y 12 historias nuevas, Sprint 5 cerrado, avance web del Sprint 6, informes de prueba S5/S6, ceremonias del S5
Co-Authored-By: Claude Sonnet 5.5 <noreply@anthropic.com>
</commit_message>
<xml_diff>
--- a/Fase 2/Evidencias Proyecto/Pruebas/SIGMA_Plan_de_Pruebas.docx
+++ b/Fase 2/Evidencias Proyecto/Pruebas/SIGMA_Plan_de_Pruebas.docx
@@ -2944,7 +2944,7 @@
               <w:rPr>
                 <w:sz w:val="19"/>
               </w:rPr>
-              <w:t>46</w:t>
+              <w:t>54</w:t>
             </w:r>
           </w:p>
         </w:tc>
@@ -2958,7 +2958,7 @@
               <w:rPr>
                 <w:sz w:val="19"/>
               </w:rPr>
-              <w:t>44</w:t>
+              <w:t>52</w:t>
             </w:r>
           </w:p>
         </w:tc>
@@ -2972,7 +2972,7 @@
               <w:rPr>
                 <w:sz w:val="19"/>
               </w:rPr>
-              <w:t>12</w:t>
+              <w:t>14</w:t>
             </w:r>
           </w:p>
         </w:tc>
@@ -3030,7 +3030,7 @@
               <w:rPr>
                 <w:sz w:val="19"/>
               </w:rPr>
-              <w:t>48</w:t>
+              <w:t>98</w:t>
             </w:r>
           </w:p>
         </w:tc>
@@ -3044,7 +3044,7 @@
               <w:rPr>
                 <w:sz w:val="19"/>
               </w:rPr>
-              <w:t>48</w:t>
+              <w:t>98</w:t>
             </w:r>
           </w:p>
         </w:tc>
@@ -3058,7 +3058,7 @@
               <w:rPr>
                 <w:sz w:val="19"/>
               </w:rPr>
-              <w:t>14</w:t>
+              <w:t>32</w:t>
             </w:r>
           </w:p>
         </w:tc>
@@ -3072,7 +3072,7 @@
               <w:rPr>
                 <w:sz w:val="19"/>
               </w:rPr>
-              <w:t>94</w:t>
+              <w:t>125</w:t>
             </w:r>
           </w:p>
         </w:tc>
@@ -3116,7 +3116,7 @@
               <w:rPr>
                 <w:sz w:val="19"/>
               </w:rPr>
-              <w:t>16</w:t>
+              <w:t>24</w:t>
             </w:r>
           </w:p>
         </w:tc>
@@ -3130,7 +3130,7 @@
               <w:rPr>
                 <w:sz w:val="19"/>
               </w:rPr>
-              <w:t>16</w:t>
+              <w:t>24</w:t>
             </w:r>
           </w:p>
         </w:tc>
@@ -3144,7 +3144,7 @@
               <w:rPr>
                 <w:sz w:val="19"/>
               </w:rPr>
-              <w:t>5</w:t>
+              <w:t>9</w:t>
             </w:r>
           </w:p>
         </w:tc>
@@ -3158,7 +3158,7 @@
               <w:rPr>
                 <w:sz w:val="19"/>
               </w:rPr>
-              <w:t>0</w:t>
+              <w:t>8</w:t>
             </w:r>
           </w:p>
         </w:tc>
@@ -3202,7 +3202,7 @@
               <w:rPr>
                 <w:sz w:val="19"/>
               </w:rPr>
-              <w:t>285</w:t>
+              <w:t>351</w:t>
             </w:r>
           </w:p>
         </w:tc>
@@ -3216,7 +3216,7 @@
               <w:rPr>
                 <w:sz w:val="19"/>
               </w:rPr>
-              <w:t>281</w:t>
+              <w:t>347</w:t>
             </w:r>
           </w:p>
         </w:tc>
@@ -3230,7 +3230,7 @@
               <w:rPr>
                 <w:sz w:val="19"/>
               </w:rPr>
-              <w:t>94</w:t>
+              <w:t>118</w:t>
             </w:r>
           </w:p>
         </w:tc>
@@ -3244,7 +3244,7 @@
               <w:rPr>
                 <w:sz w:val="19"/>
               </w:rPr>
-              <w:t>590</w:t>
+              <w:t>629</w:t>
             </w:r>
           </w:p>
         </w:tc>
@@ -3279,7 +3279,7 @@
           <w:i w:val="0"/>
           <w:sz w:val="20"/>
         </w:rPr>
-        <w:t>285 casos de aceptación ejecutados sobre 94 historias de usuario, con 590 capturas de evidencia. Los casos no conformes corresponden a comportamiento de la app sin conexión que se verifica sobre dispositivo y no desde el navegador.</w:t>
+        <w:t>351 casos de aceptación ejecutados sobre 118 historias de usuario, con 629 capturas de evidencia. Los casos no conformes corresponden a comportamiento de la app sin conexión que se verifica sobre dispositivo y no desde el navegador.</w:t>
       </w:r>
     </w:p>
     <w:p>
@@ -3384,7 +3384,7 @@
               <w:rPr>
                 <w:sz w:val="19"/>
               </w:rPr>
-              <w:t>195</w:t>
+              <w:t>221</w:t>
             </w:r>
           </w:p>
         </w:tc>
@@ -3516,7 +3516,7 @@
               <w:rPr>
                 <w:sz w:val="19"/>
               </w:rPr>
-              <w:t>18</w:t>
+              <w:t>26</w:t>
             </w:r>
           </w:p>
         </w:tc>

</xml_diff>

<commit_message>
Fase 2: web pendiente (indicadores, desempeno de SIGMA AI, carga de datos) reflejada en Sprint 6, informes de prueba, pendientes y bitacora
Co-Authored-By: Claude Sonnet 5.5 <noreply@anthropic.com>
</commit_message>
<xml_diff>
--- a/Fase 2/Evidencias Proyecto/Pruebas/SIGMA_Plan_de_Pruebas.docx
+++ b/Fase 2/Evidencias Proyecto/Pruebas/SIGMA_Plan_de_Pruebas.docx
@@ -3116,7 +3116,7 @@
               <w:rPr>
                 <w:sz w:val="19"/>
               </w:rPr>
-              <w:t>24</w:t>
+              <w:t>41</w:t>
             </w:r>
           </w:p>
         </w:tc>
@@ -3130,7 +3130,7 @@
               <w:rPr>
                 <w:sz w:val="19"/>
               </w:rPr>
-              <w:t>24</w:t>
+              <w:t>40</w:t>
             </w:r>
           </w:p>
         </w:tc>
@@ -3144,7 +3144,7 @@
               <w:rPr>
                 <w:sz w:val="19"/>
               </w:rPr>
-              <w:t>9</w:t>
+              <w:t>15</w:t>
             </w:r>
           </w:p>
         </w:tc>
@@ -3158,7 +3158,7 @@
               <w:rPr>
                 <w:sz w:val="19"/>
               </w:rPr>
-              <w:t>8</w:t>
+              <w:t>17</w:t>
             </w:r>
           </w:p>
         </w:tc>
@@ -3202,7 +3202,7 @@
               <w:rPr>
                 <w:sz w:val="19"/>
               </w:rPr>
-              <w:t>351</w:t>
+              <w:t>368</w:t>
             </w:r>
           </w:p>
         </w:tc>
@@ -3216,7 +3216,7 @@
               <w:rPr>
                 <w:sz w:val="19"/>
               </w:rPr>
-              <w:t>347</w:t>
+              <w:t>363</w:t>
             </w:r>
           </w:p>
         </w:tc>
@@ -3230,7 +3230,7 @@
               <w:rPr>
                 <w:sz w:val="19"/>
               </w:rPr>
-              <w:t>118</w:t>
+              <w:t>124</w:t>
             </w:r>
           </w:p>
         </w:tc>
@@ -3244,7 +3244,7 @@
               <w:rPr>
                 <w:sz w:val="19"/>
               </w:rPr>
-              <w:t>629</w:t>
+              <w:t>638</w:t>
             </w:r>
           </w:p>
         </w:tc>
@@ -3279,7 +3279,7 @@
           <w:i w:val="0"/>
           <w:sz w:val="20"/>
         </w:rPr>
-        <w:t>351 casos de aceptación ejecutados sobre 118 historias de usuario, con 629 capturas de evidencia. Los casos no conformes corresponden a comportamiento de la app sin conexión que se verifica sobre dispositivo y no desde el navegador.</w:t>
+        <w:t>368 casos de aceptación ejecutados sobre 124 historias de usuario, con 638 capturas de evidencia. Los casos no conformes corresponden a comportamiento de la app sin conexión que se verifica sobre dispositivo y no desde el navegador.</w:t>
       </w:r>
     </w:p>
     <w:p>
@@ -3384,7 +3384,7 @@
               <w:rPr>
                 <w:sz w:val="19"/>
               </w:rPr>
-              <w:t>221</w:t>
+              <w:t>229</w:t>
             </w:r>
           </w:p>
         </w:tc>

</xml_diff>